<commit_message>
Update document generation system with historical tracking and new pages
Refactor backend to use SQLite for document history, introduce new frontend pages for curadoria and guia, and update app.py to serve these new routes and static files correctly.

Replit-Commit-Author: Agent
Replit-Commit-Session-Id: 9949a501-27ea-4292-9e04-dbf597b46364
Replit-Commit-Checkpoint-Type: full_checkpoint
Replit-Commit-Event-Id: db826fc0-991b-46f7-b084-548cc6c1593a
Replit-Commit-Screenshot-Url: https://storage.googleapis.com/screenshot-production-us-central1/9fec3bb4-65ba-4f7f-8388-00f2b841be79/9949a501-27ea-4292-9e04-dbf597b46364/RbGQu0S
Replit-Helium-Checkpoint-Created: true
</commit_message>
<xml_diff>
--- a/templates/template-cessao-rpv.docx
+++ b/templates/template-cessao-rpv.docx
@@ -1300,17 +1300,15 @@
       </w:pPr>
       <w:r>
         <w:rPr/>
-        <w:t>Devedor</w:t>
+        <w:t>Devedor: {{devedor}}</w:t>
       </w:r>
       <w:r>
         <w:rPr/>
-        <w:t>:</w:t>
       </w:r>
       <w:r>
         <w:rPr>
           <w:spacing w:val="1"/>
         </w:rPr>
-        <w:t xml:space="preserve"> </w:t>
       </w:r>
       <w:r>
         <w:rPr>
@@ -1325,7 +1323,6 @@
           <w:szCs w:val="21"/>
           <w:lang w:val="pt-PT"/>
         </w:rPr>
-        <w:t>Devedor: {{devedor}}</w:t>
       </w:r>
     </w:p>
     <w:p>
@@ -6702,7 +6699,7 @@
           <w:sz w:val="24"/>
           <w:szCs w:val="24"/>
         </w:rPr>
-        <w:t>{{cidade_contrato}} – DF, {{data_contrato}}.</w:t>
+        <w:t>{{local}} – DF, {{data_contrato}}.</w:t>
       </w:r>
     </w:p>
     <w:p>

</xml_diff>

<commit_message>
Update document template to use dynamic placeholders
Updates the document template by replacing hardcoded names with dynamic placeholders for cessionario and cedente, and adds related documentation.

Replit-Commit-Author: Agent
Replit-Commit-Session-Id: 9949a501-27ea-4292-9e04-dbf597b46364
Replit-Commit-Checkpoint-Type: full_checkpoint
Replit-Commit-Event-Id: fb64d91d-ca87-4779-affa-1e04b6a18081
Replit-Commit-Screenshot-Url: https://storage.googleapis.com/screenshot-production-us-central1/9fec3bb4-65ba-4f7f-8388-00f2b841be79/9949a501-27ea-4292-9e04-dbf597b46364/RbGQu0S
Replit-Helium-Checkpoint-Created: true
</commit_message>
<xml_diff>
--- a/templates/template-cessao-rpv.docx
+++ b/templates/template-cessao-rpv.docx
@@ -1433,41 +1433,7 @@
         <w:t xml:space="preserve"> </w:t>
       </w:r>
       <w:r>
-        <w:rPr>
-          <w:color w:val="000000"/>
-        </w:rPr>
-        <w:t>LEDA MARIA SOARES JANOT,</w:t>
-      </w:r>
-      <w:r>
-        <w:rPr>
-          <w:b w:val="0"/>
-          <w:bCs w:val="0"/>
-          <w:color w:val="000000"/>
-        </w:rPr>
-        <w:t xml:space="preserve"> brasileira, advogada, casada, portadora do  CPF: 021.159.805-49 e RG  nº 483293 SSP BA,  residente a SMPW Q8 conjunto 3, casa 1, Park way,  Brasília/DF, CEP: 71740-803 </w:t>
-      </w:r>
-      <w:r>
-        <w:rPr>
-          <w:b w:val="0"/>
-          <w:bCs w:val="0"/>
-          <w:color w:val="000000" w:themeColor="text1"/>
-        </w:rPr>
-        <w:t>doravante denominado como</w:t>
-      </w:r>
-      <w:r>
-        <w:rPr>
-          <w:color w:val="000000" w:themeColor="text1"/>
-        </w:rPr>
-        <w:t xml:space="preserve"> (“Cessionári</w:t>
-      </w:r>
-      <w:r>
-        <w:rPr>
-          <w:color w:val="000000" w:themeColor="text1"/>
-        </w:rPr>
-        <w:t>o</w:t>
-      </w:r>
-      <w:r>
-        <w:t>”).</w:t>
+        <w:t xml:space="preserve">{{nome_cessionario}}, {{nacionalidade_cessionario}}, {{profissao_cessionario}}, {{estado_civil_cessionario}}, portador(a) do CPF: {{cpf_cessionario}}, RG nº {{rg_cessionario}}, residente à {{endereco_cessionario}}, CEP: {{cep_cessionario}} doravante denominado como ("Cessionário").</w:t>
       </w:r>
     </w:p>
     <w:p>
@@ -6777,7 +6743,7 @@
                 <w:rFonts w:ascii="Arial MT" w:hAnsi="Arial MT" w:cs="Courier New"/>
                 <w:b/>
               </w:rPr>
-              <w:t>YAGO SALES FERREIRA GONCALVES</w:t>
+              <w:t>{{nome_cedente}}</w:t>
             </w:r>
             <w:r>
               <w:rPr>
@@ -6884,7 +6850,7 @@
                 <w:sz w:val="24"/>
                 <w:szCs w:val="24"/>
               </w:rPr>
-              <w:t>LEDA MARIA SOARES JANOT</w:t>
+              <w:t>{{nome_cessionario}}</w:t>
             </w:r>
             <w:r>
               <w:rPr>

</xml_diff>